<commit_message>
order form (standard): updated template with overage fee pre-filled at $0.03
</commit_message>
<xml_diff>
--- a/.agents/skills/slack-agent/templates/order-form.docx
+++ b/.agents/skills/slack-agent/templates/order-form.docx
@@ -713,25 +713,6 @@
                 <w:commentRangeStart w:id="1"/>
               </w:sdtContent>
             </w:sdt>
-            <w:r>
-              <w:rPr>
-                <w:color w:val="000000"/>
-              </w:rPr>
-              <w:t xml:space="preserve"> $</w:t>
-            </w:r>
-            <w:r>
-              <w:rPr>
-                <w:color w:val="000000"/>
-                <w:highlight w:val="yellow"/>
-              </w:rPr>
-              <w:t>[INSERT PRICE PER CREDIT]</w:t>
-            </w:r>
-            <w:r>
-              <w:rPr>
-                <w:color w:val="000000"/>
-              </w:rPr>
-              <w:t xml:space="preserve"> </w:t>
-            </w:r>
             <w:commentRangeEnd w:id="1"/>
             <w:r>
               <w:rPr>
@@ -746,7 +727,13 @@
               <w:rPr>
                 <w:color w:val="000000"/>
               </w:rPr>
-              <w:t>per Credit. Rogo will invoice Customer for any overage fees in arrears.</w:t>
+              <w:t xml:space="preserve"> 0.03</w:t>
+            </w:r>
+            <w:r>
+              <w:rPr>
+                <w:color w:val="000000"/>
+              </w:rPr>
+              <w:t xml:space="preserve"> Credit. Rogo will invoice Customer for any overage fees in arrears.</w:t>
             </w:r>
           </w:p>
           <w:p>

</xml_diff>

<commit_message>
order form (standard): swap Platform Fee for ARR placeholder
Non-enterprise deals don't carry a hosting fee, so the order form just
shows the ARR. Template was updated to use {{ARR}} in place of
{{Platform Fee}}; add the ARR key to the data map (falls back to
pricing.total_amount if arr is unexpectedly null).

Enterprise template keeps {{Platform Fee}} -- those deals have hosting fee
broken out on a separate line, so platform fee and ARR are distinct values.

Also re-uploads the standard template as a proper binary (the prior copy
was a corrupted ~7 MB blob from a copy-paste; this one is 3.86 MB and
zip-valid).
</commit_message>
<xml_diff>
--- a/.agents/skills/slack-agent/templates/order-form.docx
+++ b/.agents/skills/slack-agent/templates/order-form.docx
@@ -591,7 +591,13 @@
               <w:t xml:space="preserve">: USD </w:t>
             </w:r>
             <w:r>
-              <w:t xml:space="preserve">$ {{Platform Fee}} </w:t>
+              <w:t>$ {{</w:t>
+            </w:r>
+            <w:r>
+              <w:t>ARR</w:t>
+            </w:r>
+            <w:r>
+              <w:t xml:space="preserve">}} </w:t>
             </w:r>
             <w:r>
               <w:t>per year for the number of Authorized Users and Credits set forth above, payable annually in advance in accordance with the Terms &amp; Conditions.</w:t>

</xml_diff>